<commit_message>
login policy  guest acccount
</commit_message>
<xml_diff>
--- a/ShopEase_Documentation.docx
+++ b/ShopEase_Documentation.docx
@@ -25,7 +25,7 @@
           <w:color w:val="64748B"/>
           <w:sz w:val="18"/>
         </w:rPr>
-        <w:t>────────────────────────────────────────────────────────────────────────</w:t>
+        <w:t>───────────────────────────────────────────────────────────────────────</w:t>
       </w:r>
     </w:p>
     <w:p/>
@@ -1619,22 +1619,135 @@
         <w:t>22</w:t>
       </w:r>
     </w:p>
-    <w:p>
-      <w:r>
-        <w:br w:type="page"/>
-      </w:r>
-    </w:p>
-    <w:p>
-      <w:pPr>
-        <w:spacing w:before="360" w:after="120"/>
-      </w:pPr>
-      <w:r>
+    <w:p/>
+    <w:p>
+      <w:pPr>
         <w:rPr>
           <w:rFonts w:ascii="Calibri" w:hAnsi="Calibri"/>
           <w:b/>
           <w:color w:val="000000"/>
           <w:sz w:val="36"/>
         </w:rPr>
+      </w:pPr>
+    </w:p>
+    <w:p>
+      <w:pPr>
+        <w:rPr>
+          <w:rFonts w:ascii="Calibri" w:hAnsi="Calibri"/>
+          <w:b/>
+          <w:color w:val="000000"/>
+          <w:sz w:val="36"/>
+        </w:rPr>
+      </w:pPr>
+    </w:p>
+    <w:p>
+      <w:pPr>
+        <w:rPr>
+          <w:rFonts w:ascii="Calibri" w:hAnsi="Calibri"/>
+          <w:b/>
+          <w:color w:val="000000"/>
+          <w:sz w:val="36"/>
+        </w:rPr>
+      </w:pPr>
+    </w:p>
+    <w:p>
+      <w:pPr>
+        <w:rPr>
+          <w:rFonts w:ascii="Calibri" w:hAnsi="Calibri"/>
+          <w:b/>
+          <w:color w:val="000000"/>
+          <w:sz w:val="36"/>
+        </w:rPr>
+      </w:pPr>
+    </w:p>
+    <w:p>
+      <w:pPr>
+        <w:rPr>
+          <w:rFonts w:ascii="Calibri" w:hAnsi="Calibri"/>
+          <w:b/>
+          <w:color w:val="000000"/>
+          <w:sz w:val="36"/>
+        </w:rPr>
+      </w:pPr>
+    </w:p>
+    <w:p>
+      <w:pPr>
+        <w:rPr>
+          <w:rFonts w:ascii="Calibri" w:hAnsi="Calibri"/>
+          <w:b/>
+          <w:color w:val="000000"/>
+          <w:sz w:val="36"/>
+        </w:rPr>
+      </w:pPr>
+    </w:p>
+    <w:p>
+      <w:pPr>
+        <w:rPr>
+          <w:rFonts w:ascii="Calibri" w:hAnsi="Calibri"/>
+          <w:b/>
+          <w:color w:val="000000"/>
+          <w:sz w:val="36"/>
+        </w:rPr>
+      </w:pPr>
+    </w:p>
+    <w:p>
+      <w:pPr>
+        <w:rPr>
+          <w:rFonts w:ascii="Calibri" w:hAnsi="Calibri"/>
+          <w:b/>
+          <w:color w:val="000000"/>
+          <w:sz w:val="36"/>
+        </w:rPr>
+      </w:pPr>
+    </w:p>
+    <w:p>
+      <w:pPr>
+        <w:rPr>
+          <w:rFonts w:ascii="Calibri" w:hAnsi="Calibri"/>
+          <w:b/>
+          <w:color w:val="000000"/>
+          <w:sz w:val="36"/>
+        </w:rPr>
+      </w:pPr>
+    </w:p>
+    <w:p>
+      <w:pPr>
+        <w:rPr>
+          <w:rFonts w:ascii="Calibri" w:hAnsi="Calibri"/>
+          <w:b/>
+          <w:color w:val="000000"/>
+          <w:sz w:val="36"/>
+        </w:rPr>
+      </w:pPr>
+    </w:p>
+    <w:p>
+      <w:pPr>
+        <w:rPr>
+          <w:rFonts w:ascii="Calibri" w:hAnsi="Calibri"/>
+          <w:b/>
+          <w:color w:val="000000"/>
+          <w:sz w:val="36"/>
+        </w:rPr>
+      </w:pPr>
+    </w:p>
+    <w:p>
+      <w:pPr>
+        <w:rPr>
+          <w:rFonts w:ascii="Calibri" w:hAnsi="Calibri"/>
+          <w:b/>
+          <w:color w:val="000000"/>
+          <w:sz w:val="36"/>
+        </w:rPr>
+      </w:pPr>
+    </w:p>
+    <w:p>
+      <w:r>
+        <w:rPr>
+          <w:rFonts w:ascii="Calibri" w:hAnsi="Calibri"/>
+          <w:b/>
+          <w:color w:val="000000"/>
+          <w:sz w:val="36"/>
+        </w:rPr>
         <w:lastRenderedPageBreak/>
         <w:t>1. Introduction</w:t>
       </w:r>
@@ -1648,7 +1761,7 @@
           <w:color w:val="64748B"/>
           <w:sz w:val="18"/>
         </w:rPr>
-        <w:t>────────────────────────────────────────────────────────────────────────</w:t>
+        <w:t>───────────────────────────────────────────────────────────────────────</w:t>
       </w:r>
     </w:p>
     <w:p>
@@ -1824,8 +1937,8 @@
         <w:tblLook w:val="04A0" w:firstRow="1" w:lastRow="0" w:firstColumn="1" w:lastColumn="0" w:noHBand="0" w:noVBand="1"/>
       </w:tblPr>
       <w:tblGrid>
-        <w:gridCol w:w="3600"/>
-        <w:gridCol w:w="5040"/>
+        <w:gridCol w:w="3522"/>
+        <w:gridCol w:w="4921"/>
       </w:tblGrid>
       <w:tr>
         <w:trPr>
@@ -2120,9 +2233,9 @@
         <w:tblLook w:val="04A0" w:firstRow="1" w:lastRow="0" w:firstColumn="1" w:lastColumn="0" w:noHBand="0" w:noVBand="1"/>
       </w:tblPr>
       <w:tblGrid>
-        <w:gridCol w:w="2602"/>
-        <w:gridCol w:w="2815"/>
-        <w:gridCol w:w="3252"/>
+        <w:gridCol w:w="2537"/>
+        <w:gridCol w:w="2734"/>
+        <w:gridCol w:w="3172"/>
       </w:tblGrid>
       <w:tr>
         <w:trPr>
@@ -2352,7 +2465,6 @@
         </w:tc>
       </w:tr>
     </w:tbl>
-    <w:p/>
     <w:p>
       <w:pPr>
         <w:spacing w:before="360" w:after="120"/>
@@ -2377,7 +2489,7 @@
           <w:color w:val="64748B"/>
           <w:sz w:val="18"/>
         </w:rPr>
-        <w:t>────────────────────────────────────────────────────────────────────────</w:t>
+        <w:t>───────────────────────────────────────────────────────────────────────</w:t>
       </w:r>
     </w:p>
     <w:p>
@@ -2402,9 +2514,9 @@
         <w:tblLook w:val="04A0" w:firstRow="1" w:lastRow="0" w:firstColumn="1" w:lastColumn="0" w:noHBand="0" w:noVBand="1"/>
       </w:tblPr>
       <w:tblGrid>
-        <w:gridCol w:w="2923"/>
-        <w:gridCol w:w="1945"/>
-        <w:gridCol w:w="3801"/>
+        <w:gridCol w:w="2866"/>
+        <w:gridCol w:w="1896"/>
+        <w:gridCol w:w="3681"/>
       </w:tblGrid>
       <w:tr>
         <w:trPr>
@@ -2763,8 +2875,8 @@
         <w:tblLook w:val="04A0" w:firstRow="1" w:lastRow="0" w:firstColumn="1" w:lastColumn="0" w:noHBand="0" w:noVBand="1"/>
       </w:tblPr>
       <w:tblGrid>
-        <w:gridCol w:w="3715"/>
-        <w:gridCol w:w="4954"/>
+        <w:gridCol w:w="3629"/>
+        <w:gridCol w:w="4814"/>
       </w:tblGrid>
       <w:tr>
         <w:trPr>
@@ -3003,14 +3115,114 @@
     <w:p>
       <w:pPr>
         <w:spacing w:before="360" w:after="120"/>
-      </w:pPr>
-      <w:r>
         <w:rPr>
           <w:rFonts w:ascii="Calibri" w:hAnsi="Calibri"/>
           <w:b/>
           <w:color w:val="000000"/>
           <w:sz w:val="36"/>
         </w:rPr>
+      </w:pPr>
+    </w:p>
+    <w:p>
+      <w:pPr>
+        <w:spacing w:before="360" w:after="120"/>
+        <w:rPr>
+          <w:rFonts w:ascii="Calibri" w:hAnsi="Calibri"/>
+          <w:b/>
+          <w:color w:val="000000"/>
+          <w:sz w:val="36"/>
+        </w:rPr>
+      </w:pPr>
+    </w:p>
+    <w:p>
+      <w:pPr>
+        <w:spacing w:before="360" w:after="120"/>
+        <w:rPr>
+          <w:rFonts w:ascii="Calibri" w:hAnsi="Calibri"/>
+          <w:b/>
+          <w:color w:val="000000"/>
+          <w:sz w:val="36"/>
+        </w:rPr>
+      </w:pPr>
+    </w:p>
+    <w:p>
+      <w:pPr>
+        <w:spacing w:before="360" w:after="120"/>
+        <w:rPr>
+          <w:rFonts w:ascii="Calibri" w:hAnsi="Calibri"/>
+          <w:b/>
+          <w:color w:val="000000"/>
+          <w:sz w:val="36"/>
+        </w:rPr>
+      </w:pPr>
+    </w:p>
+    <w:p>
+      <w:pPr>
+        <w:spacing w:before="360" w:after="120"/>
+        <w:rPr>
+          <w:rFonts w:ascii="Calibri" w:hAnsi="Calibri"/>
+          <w:b/>
+          <w:color w:val="000000"/>
+          <w:sz w:val="36"/>
+        </w:rPr>
+      </w:pPr>
+    </w:p>
+    <w:p>
+      <w:pPr>
+        <w:spacing w:before="360" w:after="120"/>
+        <w:rPr>
+          <w:rFonts w:ascii="Calibri" w:hAnsi="Calibri"/>
+          <w:b/>
+          <w:color w:val="000000"/>
+          <w:sz w:val="36"/>
+        </w:rPr>
+      </w:pPr>
+    </w:p>
+    <w:p>
+      <w:pPr>
+        <w:spacing w:before="360" w:after="120"/>
+        <w:rPr>
+          <w:rFonts w:ascii="Calibri" w:hAnsi="Calibri"/>
+          <w:b/>
+          <w:color w:val="000000"/>
+          <w:sz w:val="36"/>
+        </w:rPr>
+      </w:pPr>
+    </w:p>
+    <w:p>
+      <w:pPr>
+        <w:spacing w:before="360" w:after="120"/>
+        <w:rPr>
+          <w:rFonts w:ascii="Calibri" w:hAnsi="Calibri"/>
+          <w:b/>
+          <w:color w:val="000000"/>
+          <w:sz w:val="36"/>
+        </w:rPr>
+      </w:pPr>
+    </w:p>
+    <w:p>
+      <w:pPr>
+        <w:spacing w:before="360" w:after="120"/>
+        <w:rPr>
+          <w:rFonts w:ascii="Calibri" w:hAnsi="Calibri"/>
+          <w:b/>
+          <w:color w:val="000000"/>
+          <w:sz w:val="36"/>
+        </w:rPr>
+      </w:pPr>
+    </w:p>
+    <w:p>
+      <w:pPr>
+        <w:spacing w:before="360" w:after="120"/>
+      </w:pPr>
+      <w:r>
+        <w:rPr>
+          <w:rFonts w:ascii="Calibri" w:hAnsi="Calibri"/>
+          <w:b/>
+          <w:color w:val="000000"/>
+          <w:sz w:val="36"/>
+        </w:rPr>
+        <w:lastRenderedPageBreak/>
         <w:t>4. System Architecture</w:t>
       </w:r>
     </w:p>
@@ -3023,7 +3235,7 @@
           <w:color w:val="64748B"/>
           <w:sz w:val="18"/>
         </w:rPr>
-        <w:t>────────────────────────────────────────────────────────────────────────</w:t>
+        <w:t>───────────────────────────────────────────────────────────────────────</w:t>
       </w:r>
     </w:p>
     <w:p>
@@ -3314,7 +3526,6 @@
           <w:color w:val="000000"/>
           <w:sz w:val="28"/>
         </w:rPr>
-        <w:lastRenderedPageBreak/>
         <w:t>4.2 Application Entry Point</w:t>
       </w:r>
     </w:p>
@@ -3358,10 +3569,10 @@
         <w:tblLook w:val="04A0" w:firstRow="1" w:lastRow="0" w:firstColumn="1" w:lastColumn="0" w:noHBand="0" w:noVBand="1"/>
       </w:tblPr>
       <w:tblGrid>
-        <w:gridCol w:w="2366"/>
-        <w:gridCol w:w="2491"/>
-        <w:gridCol w:w="2021"/>
-        <w:gridCol w:w="1791"/>
+        <w:gridCol w:w="2320"/>
+        <w:gridCol w:w="2434"/>
+        <w:gridCol w:w="1943"/>
+        <w:gridCol w:w="1746"/>
       </w:tblGrid>
       <w:tr>
         <w:trPr>
@@ -4224,7 +4435,18 @@
           <w:color w:val="000000"/>
           <w:sz w:val="28"/>
         </w:rPr>
-        <w:t>4.4 Layout System</w:t>
+        <w:t>4</w:t>
+      </w:r>
+      <w:bookmarkStart w:id="0" w:name="_GoBack"/>
+      <w:bookmarkEnd w:id="0"/>
+      <w:r>
+        <w:rPr>
+          <w:rFonts w:ascii="Calibri" w:hAnsi="Calibri"/>
+          <w:b/>
+          <w:color w:val="000000"/>
+          <w:sz w:val="28"/>
+        </w:rPr>
+        <w:t>.4 Layout System</w:t>
       </w:r>
     </w:p>
     <w:p>
@@ -4233,6 +4455,7 @@
           <w:rFonts w:ascii="Calibri" w:hAnsi="Calibri"/>
           <w:color w:val="1E293B"/>
         </w:rPr>
+        <w:lastRenderedPageBreak/>
         <w:t>Public-facing pages use MainLayout, which renders the shared Navbar component at the top and an &lt;Outlet /&gt; below it to render the matched child route. Dashboard pages (Admin and User) are standalone — they render their own internal sidebar navigation without MainLayout, providing a full-page panel experience.</w:t>
       </w:r>
     </w:p>
@@ -4305,14 +4528,102 @@
     <w:p>
       <w:pPr>
         <w:spacing w:before="360" w:after="120"/>
-      </w:pPr>
-      <w:r>
         <w:rPr>
           <w:rFonts w:ascii="Calibri" w:hAnsi="Calibri"/>
           <w:b/>
           <w:color w:val="000000"/>
           <w:sz w:val="36"/>
         </w:rPr>
+      </w:pPr>
+    </w:p>
+    <w:p>
+      <w:pPr>
+        <w:spacing w:before="360" w:after="120"/>
+        <w:rPr>
+          <w:rFonts w:ascii="Calibri" w:hAnsi="Calibri"/>
+          <w:b/>
+          <w:color w:val="000000"/>
+          <w:sz w:val="36"/>
+        </w:rPr>
+      </w:pPr>
+    </w:p>
+    <w:p>
+      <w:pPr>
+        <w:spacing w:before="360" w:after="120"/>
+        <w:rPr>
+          <w:rFonts w:ascii="Calibri" w:hAnsi="Calibri"/>
+          <w:b/>
+          <w:color w:val="000000"/>
+          <w:sz w:val="36"/>
+        </w:rPr>
+      </w:pPr>
+    </w:p>
+    <w:p>
+      <w:pPr>
+        <w:spacing w:before="360" w:after="120"/>
+        <w:rPr>
+          <w:rFonts w:ascii="Calibri" w:hAnsi="Calibri"/>
+          <w:b/>
+          <w:color w:val="000000"/>
+          <w:sz w:val="36"/>
+        </w:rPr>
+      </w:pPr>
+    </w:p>
+    <w:p>
+      <w:pPr>
+        <w:spacing w:before="360" w:after="120"/>
+        <w:rPr>
+          <w:rFonts w:ascii="Calibri" w:hAnsi="Calibri"/>
+          <w:b/>
+          <w:color w:val="000000"/>
+          <w:sz w:val="36"/>
+        </w:rPr>
+      </w:pPr>
+    </w:p>
+    <w:p>
+      <w:pPr>
+        <w:spacing w:before="360" w:after="120"/>
+        <w:rPr>
+          <w:rFonts w:ascii="Calibri" w:hAnsi="Calibri"/>
+          <w:b/>
+          <w:color w:val="000000"/>
+          <w:sz w:val="36"/>
+        </w:rPr>
+      </w:pPr>
+    </w:p>
+    <w:p>
+      <w:pPr>
+        <w:spacing w:before="360" w:after="120"/>
+        <w:rPr>
+          <w:rFonts w:ascii="Calibri" w:hAnsi="Calibri"/>
+          <w:b/>
+          <w:color w:val="000000"/>
+          <w:sz w:val="36"/>
+        </w:rPr>
+      </w:pPr>
+    </w:p>
+    <w:p>
+      <w:pPr>
+        <w:spacing w:before="360" w:after="120"/>
+        <w:rPr>
+          <w:rFonts w:ascii="Calibri" w:hAnsi="Calibri"/>
+          <w:b/>
+          <w:color w:val="000000"/>
+          <w:sz w:val="36"/>
+        </w:rPr>
+      </w:pPr>
+    </w:p>
+    <w:p>
+      <w:pPr>
+        <w:spacing w:before="360" w:after="120"/>
+      </w:pPr>
+      <w:r>
+        <w:rPr>
+          <w:rFonts w:ascii="Calibri" w:hAnsi="Calibri"/>
+          <w:b/>
+          <w:color w:val="000000"/>
+          <w:sz w:val="36"/>
+        </w:rPr>
         <w:lastRenderedPageBreak/>
         <w:t>5. State Management (React Context API)</w:t>
       </w:r>
@@ -4326,7 +4637,7 @@
           <w:color w:val="64748B"/>
           <w:sz w:val="18"/>
         </w:rPr>
-        <w:t>────────────────────────────────────────────────────────────────────────</w:t>
+        <w:t>───────────────────────────────────────────────────────────────────────</w:t>
       </w:r>
     </w:p>
     <w:p>
@@ -4648,7 +4959,7 @@
           <w:color w:val="64748B"/>
           <w:sz w:val="18"/>
         </w:rPr>
-        <w:t>────────────────────────────────────────────────────────────────────────</w:t>
+        <w:t>───────────────────────────────────────────────────────────────────────</w:t>
       </w:r>
     </w:p>
     <w:p>
@@ -4916,9 +5227,22 @@
           <w:sz w:val="28"/>
         </w:rPr>
         <w:lastRenderedPageBreak/>
-        <w:t xml:space="preserve">6.7 Admin Login </w:t>
-      </w:r>
-      <w:proofErr w:type="gramStart"/>
+        <w:t>6.7 Admin Login Page  (/admin-login)</w:t>
+      </w:r>
+    </w:p>
+    <w:p>
+      <w:r>
+        <w:rPr>
+          <w:rFonts w:ascii="Calibri" w:hAnsi="Calibri"/>
+          <w:color w:val="1E293B"/>
+        </w:rPr>
+        <w:t>Standalone login page for Admins with a two-field form (username + password). Default credentials: username = admin / password = admin123. On success, redirects to /admin/dashboard via AuthContext.loginAdmin().</w:t>
+      </w:r>
+    </w:p>
+    <w:p>
+      <w:pPr>
+        <w:spacing w:before="240" w:after="80"/>
+      </w:pPr>
       <w:r>
         <w:rPr>
           <w:rFonts w:ascii="Calibri" w:hAnsi="Calibri"/>
@@ -4926,9 +5250,22 @@
           <w:color w:val="000000"/>
           <w:sz w:val="28"/>
         </w:rPr>
-        <w:t>Page  (</w:t>
-      </w:r>
-      <w:proofErr w:type="gramEnd"/>
+        <w:t>6.8 User Login Page  (/user-login)</w:t>
+      </w:r>
+    </w:p>
+    <w:p>
+      <w:r>
+        <w:rPr>
+          <w:rFonts w:ascii="Calibri" w:hAnsi="Calibri"/>
+          <w:color w:val="1E293B"/>
+        </w:rPr>
+        <w:t>Standalone login page for registered Users. Default credentials: username = user / password = user123. On success, redirects to /user/dashboard via AuthContext.loginUser().</w:t>
+      </w:r>
+    </w:p>
+    <w:p>
+      <w:pPr>
+        <w:spacing w:before="240" w:after="80"/>
+      </w:pPr>
       <w:r>
         <w:rPr>
           <w:rFonts w:ascii="Calibri" w:hAnsi="Calibri"/>
@@ -4936,7 +5273,7 @@
           <w:color w:val="000000"/>
           <w:sz w:val="28"/>
         </w:rPr>
-        <w:t>/admin-login)</w:t>
+        <w:t>6.9 Admin Dashboard  (/admin/dashboard)</w:t>
       </w:r>
     </w:p>
     <w:p>
@@ -4945,7 +5282,72 @@
           <w:rFonts w:ascii="Calibri" w:hAnsi="Calibri"/>
           <w:color w:val="1E293B"/>
         </w:rPr>
-        <w:t>Standalone login page for Admins with a two-field form (username + password). Default credentials: username = admin / password = admin123. On success, redirects to /admin/dashboard via AuthContext.loginAdmin().</w:t>
+        <w:t>A comprehensive protected admin panel (~35 KB) with multiple internal tabs:</w:t>
+      </w:r>
+    </w:p>
+    <w:p>
+      <w:pPr>
+        <w:pStyle w:val="ListBullet"/>
+        <w:ind w:left="432"/>
+      </w:pPr>
+      <w:r>
+        <w:rPr>
+          <w:rFonts w:ascii="Calibri" w:hAnsi="Calibri"/>
+          <w:color w:val="1E293B"/>
+        </w:rPr>
+        <w:t>Overview — revenue cards, recent orders table, visitor stats</w:t>
+      </w:r>
+    </w:p>
+    <w:p>
+      <w:pPr>
+        <w:pStyle w:val="ListBullet"/>
+        <w:ind w:left="432"/>
+      </w:pPr>
+      <w:r>
+        <w:rPr>
+          <w:rFonts w:ascii="Calibri" w:hAnsi="Calibri"/>
+          <w:color w:val="1E293B"/>
+        </w:rPr>
+        <w:t>Products — full product CRUD: add new products, edit name/price/category/description, delete products</w:t>
+      </w:r>
+    </w:p>
+    <w:p>
+      <w:pPr>
+        <w:pStyle w:val="ListBullet"/>
+        <w:ind w:left="432"/>
+      </w:pPr>
+      <w:r>
+        <w:rPr>
+          <w:rFonts w:ascii="Calibri" w:hAnsi="Calibri"/>
+          <w:color w:val="1E293B"/>
+        </w:rPr>
+        <w:t>Orders — paginated order list with status badges (Delivered, Processing, Shipped, Pending)</w:t>
+      </w:r>
+    </w:p>
+    <w:p>
+      <w:pPr>
+        <w:pStyle w:val="ListBullet"/>
+        <w:ind w:left="432"/>
+      </w:pPr>
+      <w:r>
+        <w:rPr>
+          <w:rFonts w:ascii="Calibri" w:hAnsi="Calibri"/>
+          <w:color w:val="1E293B"/>
+        </w:rPr>
+        <w:t>Customers — mock customer directory with search and filter</w:t>
+      </w:r>
+    </w:p>
+    <w:p>
+      <w:pPr>
+        <w:pStyle w:val="ListBullet"/>
+        <w:ind w:left="432"/>
+      </w:pPr>
+      <w:r>
+        <w:rPr>
+          <w:rFonts w:ascii="Calibri" w:hAnsi="Calibri"/>
+          <w:color w:val="1E293B"/>
+        </w:rPr>
+        <w:t>Settings — change admin password and user password via AuthContext.changePassword()</w:t>
       </w:r>
     </w:p>
     <w:p>
@@ -4959,7 +5361,7 @@
           <w:color w:val="000000"/>
           <w:sz w:val="28"/>
         </w:rPr>
-        <w:t>6.8 User Login Page  (/user-login)</w:t>
+        <w:t>6.10 User Dashboard  (/user/dashboard)</w:t>
       </w:r>
     </w:p>
     <w:p>
@@ -4968,7 +5370,72 @@
           <w:rFonts w:ascii="Calibri" w:hAnsi="Calibri"/>
           <w:color w:val="1E293B"/>
         </w:rPr>
-        <w:t>Standalone login page for registered Users. Default credentials: username = user / password = user123. On success, redirects to /user/dashboard via AuthContext.loginUser().</w:t>
+        <w:t>A protected dashboard for registered users (~30 KB) featuring:</w:t>
+      </w:r>
+    </w:p>
+    <w:p>
+      <w:pPr>
+        <w:pStyle w:val="ListBullet"/>
+        <w:ind w:left="432"/>
+      </w:pPr>
+      <w:r>
+        <w:rPr>
+          <w:rFonts w:ascii="Calibri" w:hAnsi="Calibri"/>
+          <w:color w:val="1E293B"/>
+        </w:rPr>
+        <w:t>Dashboard Overview — order count, wishlist count, spent total</w:t>
+      </w:r>
+    </w:p>
+    <w:p>
+      <w:pPr>
+        <w:pStyle w:val="ListBullet"/>
+        <w:ind w:left="432"/>
+      </w:pPr>
+      <w:r>
+        <w:rPr>
+          <w:rFonts w:ascii="Calibri" w:hAnsi="Calibri"/>
+          <w:color w:val="1E293B"/>
+        </w:rPr>
+        <w:t>My Orders — order history table with status tracking and 'Buy Again' action</w:t>
+      </w:r>
+    </w:p>
+    <w:p>
+      <w:pPr>
+        <w:pStyle w:val="ListBullet"/>
+        <w:ind w:left="432"/>
+      </w:pPr>
+      <w:r>
+        <w:rPr>
+          <w:rFonts w:ascii="Calibri" w:hAnsi="Calibri"/>
+          <w:color w:val="1E293B"/>
+        </w:rPr>
+        <w:t>Wishlist — saved products with quick-add to cart</w:t>
+      </w:r>
+    </w:p>
+    <w:p>
+      <w:pPr>
+        <w:pStyle w:val="ListBullet"/>
+        <w:ind w:left="432"/>
+      </w:pPr>
+      <w:r>
+        <w:rPr>
+          <w:rFonts w:ascii="Calibri" w:hAnsi="Calibri"/>
+          <w:color w:val="1E293B"/>
+        </w:rPr>
+        <w:t>Delivery Map — interactive Nepal province map showing delivery coverage</w:t>
+      </w:r>
+    </w:p>
+    <w:p>
+      <w:pPr>
+        <w:pStyle w:val="ListBullet"/>
+        <w:ind w:left="432"/>
+      </w:pPr>
+      <w:r>
+        <w:rPr>
+          <w:rFonts w:ascii="Calibri" w:hAnsi="Calibri"/>
+          <w:color w:val="1E293B"/>
+        </w:rPr>
+        <w:t>Settings — account settings panel</w:t>
       </w:r>
     </w:p>
     <w:p>
@@ -4982,7 +5449,7 @@
           <w:color w:val="000000"/>
           <w:sz w:val="28"/>
         </w:rPr>
-        <w:t>6.9 Admin Dashboard  (/admin/dashboard)</w:t>
+        <w:t>6.11 User Profile Page  (/user/profile)</w:t>
       </w:r>
     </w:p>
     <w:p>
@@ -4991,72 +5458,67 @@
           <w:rFonts w:ascii="Calibri" w:hAnsi="Calibri"/>
           <w:color w:val="1E293B"/>
         </w:rPr>
-        <w:t>A comprehensive protected admin panel (~35 KB) with multiple internal tabs:</w:t>
-      </w:r>
-    </w:p>
-    <w:p>
-      <w:pPr>
-        <w:pStyle w:val="ListBullet"/>
-        <w:ind w:left="432"/>
-      </w:pPr>
-      <w:r>
-        <w:rPr>
-          <w:rFonts w:ascii="Calibri" w:hAnsi="Calibri"/>
-          <w:color w:val="1E293B"/>
-        </w:rPr>
-        <w:t>Overview — revenue cards, recent orders table, visitor stats</w:t>
-      </w:r>
-    </w:p>
-    <w:p>
-      <w:pPr>
-        <w:pStyle w:val="ListBullet"/>
-        <w:ind w:left="432"/>
-      </w:pPr>
-      <w:r>
-        <w:rPr>
-          <w:rFonts w:ascii="Calibri" w:hAnsi="Calibri"/>
-          <w:color w:val="1E293B"/>
-        </w:rPr>
-        <w:t>Products — full product CRUD: add new products, edit name/price/category/description, delete products</w:t>
-      </w:r>
-    </w:p>
-    <w:p>
-      <w:pPr>
-        <w:pStyle w:val="ListBullet"/>
-        <w:ind w:left="432"/>
-      </w:pPr>
-      <w:r>
-        <w:rPr>
-          <w:rFonts w:ascii="Calibri" w:hAnsi="Calibri"/>
-          <w:color w:val="1E293B"/>
-        </w:rPr>
-        <w:t>Orders — paginated order list with status badges (Delivered, Processing, Shipped, Pending)</w:t>
-      </w:r>
-    </w:p>
-    <w:p>
-      <w:pPr>
-        <w:pStyle w:val="ListBullet"/>
-        <w:ind w:left="432"/>
-      </w:pPr>
-      <w:r>
-        <w:rPr>
-          <w:rFonts w:ascii="Calibri" w:hAnsi="Calibri"/>
-          <w:color w:val="1E293B"/>
-        </w:rPr>
-        <w:t>Customers — mock customer directory with search and filter</w:t>
-      </w:r>
-    </w:p>
-    <w:p>
-      <w:pPr>
-        <w:pStyle w:val="ListBullet"/>
-        <w:ind w:left="432"/>
-      </w:pPr>
-      <w:r>
-        <w:rPr>
-          <w:rFonts w:ascii="Calibri" w:hAnsi="Calibri"/>
-          <w:color w:val="1E293B"/>
-        </w:rPr>
-        <w:t>Settings — change admin password and user password via AuthContext.changePassword()</w:t>
+        <w:t>Allows logged-in users to view and edit their profile details: full name, email address, phone number, and delivery address. Changes are saved to the current session via AuthContext.updateProfile().</w:t>
+      </w:r>
+    </w:p>
+    <w:p>
+      <w:pPr>
+        <w:spacing w:before="360" w:after="120"/>
+        <w:rPr>
+          <w:rFonts w:ascii="Calibri" w:hAnsi="Calibri"/>
+          <w:b/>
+          <w:color w:val="000000"/>
+          <w:sz w:val="36"/>
+        </w:rPr>
+      </w:pPr>
+    </w:p>
+    <w:p>
+      <w:pPr>
+        <w:spacing w:before="360" w:after="120"/>
+        <w:rPr>
+          <w:rFonts w:ascii="Calibri" w:hAnsi="Calibri"/>
+          <w:b/>
+          <w:color w:val="000000"/>
+          <w:sz w:val="36"/>
+        </w:rPr>
+      </w:pPr>
+    </w:p>
+    <w:p>
+      <w:pPr>
+        <w:spacing w:before="360" w:after="120"/>
+        <w:rPr>
+          <w:rFonts w:ascii="Calibri" w:hAnsi="Calibri"/>
+          <w:b/>
+          <w:color w:val="000000"/>
+          <w:sz w:val="36"/>
+        </w:rPr>
+      </w:pPr>
+    </w:p>
+    <w:p>
+      <w:pPr>
+        <w:spacing w:before="360" w:after="120"/>
+      </w:pPr>
+      <w:r>
+        <w:rPr>
+          <w:rFonts w:ascii="Calibri" w:hAnsi="Calibri"/>
+          <w:b/>
+          <w:color w:val="000000"/>
+          <w:sz w:val="36"/>
+        </w:rPr>
+        <w:lastRenderedPageBreak/>
+        <w:t>7. Components</w:t>
+      </w:r>
+    </w:p>
+    <w:p>
+      <w:pPr>
+        <w:spacing w:after="160"/>
+      </w:pPr>
+      <w:r>
+        <w:rPr>
+          <w:color w:val="64748B"/>
+          <w:sz w:val="18"/>
+        </w:rPr>
+        <w:t>───────────────────────────────────────────────────────────────────────</w:t>
       </w:r>
     </w:p>
     <w:p>
@@ -5070,7 +5532,7 @@
           <w:color w:val="000000"/>
           <w:sz w:val="28"/>
         </w:rPr>
-        <w:t>6.10 User Dashboard  (/user/dashboard)</w:t>
+        <w:t>7.1 Navbar</w:t>
       </w:r>
     </w:p>
     <w:p>
@@ -5079,72 +5541,7 @@
           <w:rFonts w:ascii="Calibri" w:hAnsi="Calibri"/>
           <w:color w:val="1E293B"/>
         </w:rPr>
-        <w:t>A protected dashboard for registered users (~30 KB) featuring:</w:t>
-      </w:r>
-    </w:p>
-    <w:p>
-      <w:pPr>
-        <w:pStyle w:val="ListBullet"/>
-        <w:ind w:left="432"/>
-      </w:pPr>
-      <w:r>
-        <w:rPr>
-          <w:rFonts w:ascii="Calibri" w:hAnsi="Calibri"/>
-          <w:color w:val="1E293B"/>
-        </w:rPr>
-        <w:t>Dashboard Overview — order count, wishlist count, spent total</w:t>
-      </w:r>
-    </w:p>
-    <w:p>
-      <w:pPr>
-        <w:pStyle w:val="ListBullet"/>
-        <w:ind w:left="432"/>
-      </w:pPr>
-      <w:r>
-        <w:rPr>
-          <w:rFonts w:ascii="Calibri" w:hAnsi="Calibri"/>
-          <w:color w:val="1E293B"/>
-        </w:rPr>
-        <w:t>My Orders — order history table with status tracking and 'Buy Again' action</w:t>
-      </w:r>
-    </w:p>
-    <w:p>
-      <w:pPr>
-        <w:pStyle w:val="ListBullet"/>
-        <w:ind w:left="432"/>
-      </w:pPr>
-      <w:r>
-        <w:rPr>
-          <w:rFonts w:ascii="Calibri" w:hAnsi="Calibri"/>
-          <w:color w:val="1E293B"/>
-        </w:rPr>
-        <w:t>Wishlist — saved products with quick-add to cart</w:t>
-      </w:r>
-    </w:p>
-    <w:p>
-      <w:pPr>
-        <w:pStyle w:val="ListBullet"/>
-        <w:ind w:left="432"/>
-      </w:pPr>
-      <w:r>
-        <w:rPr>
-          <w:rFonts w:ascii="Calibri" w:hAnsi="Calibri"/>
-          <w:color w:val="1E293B"/>
-        </w:rPr>
-        <w:t>Delivery Map — interactive Nepal province map showing delivery coverage</w:t>
-      </w:r>
-    </w:p>
-    <w:p>
-      <w:pPr>
-        <w:pStyle w:val="ListBullet"/>
-        <w:ind w:left="432"/>
-      </w:pPr>
-      <w:r>
-        <w:rPr>
-          <w:rFonts w:ascii="Calibri" w:hAnsi="Calibri"/>
-          <w:color w:val="1E293B"/>
-        </w:rPr>
-        <w:t>Settings — account settings panel</w:t>
+        <w:t>The shared top navigation bar rendered by MainLayout (~16 KB). Features include: ShopEase brand logo, main navigation links (Home, About, Policy, Contact), a product search bar, a cart icon with live item count badge, user login/logout toggle, and a slide-out cart drawer. Fully responsive with a mobile hamburger menu.</w:t>
       </w:r>
     </w:p>
     <w:p>
@@ -5158,7 +5555,7 @@
           <w:color w:val="000000"/>
           <w:sz w:val="28"/>
         </w:rPr>
-        <w:t>6.11 User Profile Page  (/user/profile)</w:t>
+        <w:t>7.2 ProtectedRoute</w:t>
       </w:r>
     </w:p>
     <w:p>
@@ -5167,7 +5564,53 @@
           <w:rFonts w:ascii="Calibri" w:hAnsi="Calibri"/>
           <w:color w:val="1E293B"/>
         </w:rPr>
-        <w:t>Allows logged-in users to view and edit their profile details: full name, email address, phone number, and delivery address. Changes are saved to the current session via AuthContext.updateProfile().</w:t>
+        <w:t>A HOC (Higher-Order Component) wrapper that checks the current user's role from AuthContext. If the user is not logged in or does not have the required role, it redirects them to the appropriate login page. Used to guard both /admin/dashboard and /user/dashboard routes.</w:t>
+      </w:r>
+    </w:p>
+    <w:p>
+      <w:pPr>
+        <w:spacing w:before="240" w:after="80"/>
+      </w:pPr>
+      <w:r>
+        <w:rPr>
+          <w:rFonts w:ascii="Calibri" w:hAnsi="Calibri"/>
+          <w:b/>
+          <w:color w:val="000000"/>
+          <w:sz w:val="28"/>
+        </w:rPr>
+        <w:t>7.3 NepalDeliveryMap</w:t>
+      </w:r>
+    </w:p>
+    <w:p>
+      <w:r>
+        <w:rPr>
+          <w:rFonts w:ascii="Calibri" w:hAnsi="Calibri"/>
+          <w:color w:val="1E293B"/>
+        </w:rPr>
+        <w:t>An SVG-based interactive map of Nepal rendered on the Home Page, showing delivery coverage zones across Nepal's seven provinces. Provinces highlight on hover and display coverage tooltips.</w:t>
+      </w:r>
+    </w:p>
+    <w:p>
+      <w:pPr>
+        <w:spacing w:before="240" w:after="80"/>
+      </w:pPr>
+      <w:r>
+        <w:rPr>
+          <w:rFonts w:ascii="Calibri" w:hAnsi="Calibri"/>
+          <w:b/>
+          <w:color w:val="000000"/>
+          <w:sz w:val="28"/>
+        </w:rPr>
+        <w:t>7.4 NepalInteractiveMap</w:t>
+      </w:r>
+    </w:p>
+    <w:p>
+      <w:r>
+        <w:rPr>
+          <w:rFonts w:ascii="Calibri" w:hAnsi="Calibri"/>
+          <w:color w:val="1E293B"/>
+        </w:rPr>
+        <w:t>An enhanced version of the delivery map used inside the User Dashboard. Displays a per-province delivery status with color-coded indicators and a legend showing coverage tiers.</w:t>
       </w:r>
     </w:p>
     <w:p>
@@ -5180,147 +5623,6 @@
           <w:sz w:val="36"/>
         </w:rPr>
       </w:pPr>
-    </w:p>
-    <w:p>
-      <w:pPr>
-        <w:spacing w:before="360" w:after="120"/>
-        <w:rPr>
-          <w:rFonts w:ascii="Calibri" w:hAnsi="Calibri"/>
-          <w:b/>
-          <w:color w:val="000000"/>
-          <w:sz w:val="36"/>
-        </w:rPr>
-      </w:pPr>
-    </w:p>
-    <w:p>
-      <w:pPr>
-        <w:spacing w:before="360" w:after="120"/>
-        <w:rPr>
-          <w:rFonts w:ascii="Calibri" w:hAnsi="Calibri"/>
-          <w:b/>
-          <w:color w:val="000000"/>
-          <w:sz w:val="36"/>
-        </w:rPr>
-      </w:pPr>
-    </w:p>
-    <w:p>
-      <w:pPr>
-        <w:spacing w:before="360" w:after="120"/>
-      </w:pPr>
-      <w:r>
-        <w:rPr>
-          <w:rFonts w:ascii="Calibri" w:hAnsi="Calibri"/>
-          <w:b/>
-          <w:color w:val="000000"/>
-          <w:sz w:val="36"/>
-        </w:rPr>
-        <w:lastRenderedPageBreak/>
-        <w:t>7. Components</w:t>
-      </w:r>
-    </w:p>
-    <w:p>
-      <w:pPr>
-        <w:spacing w:after="160"/>
-      </w:pPr>
-      <w:r>
-        <w:rPr>
-          <w:color w:val="64748B"/>
-          <w:sz w:val="18"/>
-        </w:rPr>
-        <w:t>────────────────────────────────────────────────────────────────────────</w:t>
-      </w:r>
-    </w:p>
-    <w:p>
-      <w:pPr>
-        <w:spacing w:before="240" w:after="80"/>
-      </w:pPr>
-      <w:r>
-        <w:rPr>
-          <w:rFonts w:ascii="Calibri" w:hAnsi="Calibri"/>
-          <w:b/>
-          <w:color w:val="000000"/>
-          <w:sz w:val="28"/>
-        </w:rPr>
-        <w:t>7.1 Navbar</w:t>
-      </w:r>
-    </w:p>
-    <w:p>
-      <w:r>
-        <w:rPr>
-          <w:rFonts w:ascii="Calibri" w:hAnsi="Calibri"/>
-          <w:color w:val="1E293B"/>
-        </w:rPr>
-        <w:t>The shared top navigation bar rendered by MainLayout (~16 KB). Features include: ShopEase brand logo, main navigation links (Home, About, Policy, Contact), a product search bar, a cart icon with live item count badge, user login/logout toggle, and a slide-out cart drawer. Fully responsive with a mobile hamburger menu.</w:t>
-      </w:r>
-    </w:p>
-    <w:p>
-      <w:pPr>
-        <w:spacing w:before="240" w:after="80"/>
-      </w:pPr>
-      <w:r>
-        <w:rPr>
-          <w:rFonts w:ascii="Calibri" w:hAnsi="Calibri"/>
-          <w:b/>
-          <w:color w:val="000000"/>
-          <w:sz w:val="28"/>
-        </w:rPr>
-        <w:t>7.2 ProtectedRoute</w:t>
-      </w:r>
-    </w:p>
-    <w:p>
-      <w:r>
-        <w:rPr>
-          <w:rFonts w:ascii="Calibri" w:hAnsi="Calibri"/>
-          <w:color w:val="1E293B"/>
-        </w:rPr>
-        <w:t>A HOC (Higher-Order Component) wrapper that checks the current user's role from AuthContext. If the user is not logged in or does not have the required role, it redirects them to the appropriate login page. Used to guard both /admin/dashboard and /user/dashboard routes.</w:t>
-      </w:r>
-    </w:p>
-    <w:p>
-      <w:pPr>
-        <w:spacing w:before="240" w:after="80"/>
-      </w:pPr>
-      <w:r>
-        <w:rPr>
-          <w:rFonts w:ascii="Calibri" w:hAnsi="Calibri"/>
-          <w:b/>
-          <w:color w:val="000000"/>
-          <w:sz w:val="28"/>
-        </w:rPr>
-        <w:t>7.3 NepalDeliveryMap</w:t>
-      </w:r>
-    </w:p>
-    <w:p>
-      <w:r>
-        <w:rPr>
-          <w:rFonts w:ascii="Calibri" w:hAnsi="Calibri"/>
-          <w:color w:val="1E293B"/>
-        </w:rPr>
-        <w:t>An SVG-based interactive map of Nepal rendered on the Home Page, showing delivery coverage zones across Nepal's seven provinces. Provinces highlight on hover and display coverage tooltips.</w:t>
-      </w:r>
-    </w:p>
-    <w:p>
-      <w:pPr>
-        <w:spacing w:before="240" w:after="80"/>
-      </w:pPr>
-      <w:r>
-        <w:rPr>
-          <w:rFonts w:ascii="Calibri" w:hAnsi="Calibri"/>
-          <w:b/>
-          <w:color w:val="000000"/>
-          <w:sz w:val="28"/>
-        </w:rPr>
-        <w:t>7.4 NepalInteractiveMap</w:t>
-      </w:r>
-    </w:p>
-    <w:p>
-      <w:r>
-        <w:rPr>
-          <w:rFonts w:ascii="Calibri" w:hAnsi="Calibri"/>
-          <w:color w:val="1E293B"/>
-        </w:rPr>
-        <w:t>An enhanced version of the delivery map used inside the User Dashboard. Displays a per-province delivery status with color-coded indicators and a legend showing coverage tiers.</w:t>
-      </w:r>
     </w:p>
     <w:p>
       <w:pPr>
@@ -5437,9 +5739,9 @@
         <w:tblLook w:val="04A0" w:firstRow="1" w:lastRow="0" w:firstColumn="1" w:lastColumn="0" w:noHBand="0" w:noVBand="1"/>
       </w:tblPr>
       <w:tblGrid>
-        <w:gridCol w:w="2004"/>
-        <w:gridCol w:w="1964"/>
-        <w:gridCol w:w="4701"/>
+        <w:gridCol w:w="1968"/>
+        <w:gridCol w:w="1919"/>
+        <w:gridCol w:w="4556"/>
       </w:tblGrid>
       <w:tr>
         <w:trPr>
@@ -5966,10 +6268,10 @@
         <w:tblLook w:val="04A0" w:firstRow="1" w:lastRow="0" w:firstColumn="1" w:lastColumn="0" w:noHBand="0" w:noVBand="1"/>
       </w:tblPr>
       <w:tblGrid>
-        <w:gridCol w:w="491"/>
-        <w:gridCol w:w="3833"/>
-        <w:gridCol w:w="2553"/>
-        <w:gridCol w:w="1792"/>
+        <w:gridCol w:w="483"/>
+        <w:gridCol w:w="3722"/>
+        <w:gridCol w:w="2491"/>
+        <w:gridCol w:w="1747"/>
       </w:tblGrid>
       <w:tr>
         <w:trPr>
@@ -6636,8 +6938,8 @@
         <w:tblLook w:val="04A0" w:firstRow="1" w:lastRow="0" w:firstColumn="1" w:lastColumn="0" w:noHBand="0" w:noVBand="1"/>
       </w:tblPr>
       <w:tblGrid>
-        <w:gridCol w:w="3436"/>
-        <w:gridCol w:w="5233"/>
+        <w:gridCol w:w="3398"/>
+        <w:gridCol w:w="5045"/>
       </w:tblGrid>
       <w:tr>
         <w:trPr>
@@ -8105,10 +8407,10 @@
         <w:tblLook w:val="04A0" w:firstRow="1" w:lastRow="0" w:firstColumn="1" w:lastColumn="0" w:noHBand="0" w:noVBand="1"/>
       </w:tblPr>
       <w:tblGrid>
-        <w:gridCol w:w="1566"/>
-        <w:gridCol w:w="2581"/>
-        <w:gridCol w:w="1974"/>
-        <w:gridCol w:w="2548"/>
+        <w:gridCol w:w="1529"/>
+        <w:gridCol w:w="2512"/>
+        <w:gridCol w:w="1931"/>
+        <w:gridCol w:w="2471"/>
       </w:tblGrid>
       <w:tr>
         <w:trPr>
@@ -8981,8 +9283,8 @@
         <w:tblLook w:val="04A0" w:firstRow="1" w:lastRow="0" w:firstColumn="1" w:lastColumn="0" w:noHBand="0" w:noVBand="1"/>
       </w:tblPr>
       <w:tblGrid>
-        <w:gridCol w:w="3089"/>
-        <w:gridCol w:w="5580"/>
+        <w:gridCol w:w="3038"/>
+        <w:gridCol w:w="5405"/>
       </w:tblGrid>
       <w:tr>
         <w:trPr>
@@ -9536,48 +9838,8 @@
           <w:sz w:val="36"/>
         </w:rPr>
         <w:lastRenderedPageBreak/>
-        <w:t>13. Conclusion</w:t>
-      </w:r>
-    </w:p>
-    <w:p>
-      <w:pPr>
-        <w:spacing w:after="160"/>
-      </w:pPr>
-      <w:r>
-        <w:rPr>
-          <w:color w:val="64748B"/>
-          <w:sz w:val="18"/>
-        </w:rPr>
-        <w:t>───────────────────────────────────────────────────────────────────────</w:t>
-      </w:r>
-    </w:p>
-    <w:p>
-      <w:r>
-        <w:rPr>
-          <w:rFonts w:ascii="Calibri" w:hAnsi="Calibri"/>
-          <w:color w:val="1E293B"/>
-        </w:rPr>
-        <w:t>ShopEase Nepal successfully demonstrates the design and implementation of a modern e-commerce frontend application using the React ecosystem. The project achieves its primary objectives: a visually polished, multi-role UI with amber-themed branding, clean component architecture, real-time cart management, and an automated deployment pipeline.</w:t>
-      </w:r>
-    </w:p>
-    <w:p>
-      <w:r>
-        <w:rPr>
-          <w:rFonts w:ascii="Calibri" w:hAnsi="Calibri"/>
-          <w:color w:val="1E293B"/>
-        </w:rPr>
-        <w:t>The codebase is structured for future scalability — context providers can be swapped for Redux or Zustand, static data can be replaced with API calls, and the Vite build pipeline already supports environment-based configuration for different deployment targets. The project serves as both a functional ecommerce prototype and a strong portfolio piece demonstrating team-based React development.</w:t>
-      </w:r>
-    </w:p>
-    <w:p>
-      <w:r>
-        <w:br w:type="page"/>
-      </w:r>
-    </w:p>
-    <w:p>
-      <w:pPr>
-        <w:spacing w:before="360" w:after="120"/>
-      </w:pPr>
+        <w:t>1</w:t>
+      </w:r>
       <w:r>
         <w:rPr>
           <w:rFonts w:ascii="Calibri" w:hAnsi="Calibri"/>
@@ -9585,8 +9847,16 @@
           <w:color w:val="000000"/>
           <w:sz w:val="36"/>
         </w:rPr>
-        <w:lastRenderedPageBreak/>
-        <w:t>14. System UI Screenshots</w:t>
+        <w:t>3</w:t>
+      </w:r>
+      <w:r>
+        <w:rPr>
+          <w:rFonts w:ascii="Calibri" w:hAnsi="Calibri"/>
+          <w:b/>
+          <w:color w:val="000000"/>
+          <w:sz w:val="36"/>
+        </w:rPr>
+        <w:t>. System UI Screenshots</w:t>
       </w:r>
     </w:p>
     <w:p>
@@ -9598,7 +9868,7 @@
           <w:color w:val="64748B"/>
           <w:sz w:val="18"/>
         </w:rPr>
-        <w:t>────────────────────────────────────────────────────────────────────────</w:t>
+        <w:t>───────────────────────────────────────────────────────────────────────</w:t>
       </w:r>
     </w:p>
     <w:p>
@@ -9612,7 +9882,25 @@
           <w:color w:val="000000"/>
           <w:sz w:val="28"/>
         </w:rPr>
-        <w:t>14.1 Home Page</w:t>
+        <w:t>1</w:t>
+      </w:r>
+      <w:r>
+        <w:rPr>
+          <w:rFonts w:ascii="Calibri" w:hAnsi="Calibri"/>
+          <w:b/>
+          <w:color w:val="000000"/>
+          <w:sz w:val="28"/>
+        </w:rPr>
+        <w:t>3</w:t>
+      </w:r>
+      <w:r>
+        <w:rPr>
+          <w:rFonts w:ascii="Calibri" w:hAnsi="Calibri"/>
+          <w:b/>
+          <w:color w:val="000000"/>
+          <w:sz w:val="28"/>
+        </w:rPr>
+        <w:t>.1 Home Page</w:t>
       </w:r>
     </w:p>
     <w:p>
@@ -9633,10 +9921,10 @@
           <w:noProof/>
         </w:rPr>
         <w:drawing>
-          <wp:inline distT="0" distB="0" distL="0" distR="0">
-            <wp:extent cx="5303520" cy="5303520"/>
-            <wp:effectExtent l="0" t="0" r="0" b="0"/>
-            <wp:docPr id="1" name="Picture 1"/>
+          <wp:inline distT="0" distB="0" distL="0" distR="0" wp14:anchorId="7F3CCC02" wp14:editId="673F64C3">
+            <wp:extent cx="5367655" cy="2253615"/>
+            <wp:effectExtent l="0" t="0" r="4445" b="0"/>
+            <wp:docPr id="7" name="Picture 7"/>
             <wp:cNvGraphicFramePr>
               <a:graphicFrameLocks xmlns:a="http://schemas.openxmlformats.org/drawingml/2006/main" noChangeAspect="1"/>
             </wp:cNvGraphicFramePr>
@@ -9644,7 +9932,7 @@
               <a:graphicData uri="http://schemas.openxmlformats.org/drawingml/2006/picture">
                 <pic:pic xmlns:pic="http://schemas.openxmlformats.org/drawingml/2006/picture">
                   <pic:nvPicPr>
-                    <pic:cNvPr id="0" name="ui_homepage_1782228888983.png"/>
+                    <pic:cNvPr id="1" name=""/>
                     <pic:cNvPicPr/>
                   </pic:nvPicPr>
                   <pic:blipFill>
@@ -9656,7 +9944,7 @@
                   <pic:spPr>
                     <a:xfrm>
                       <a:off x="0" y="0"/>
-                      <a:ext cx="5303520" cy="5303520"/>
+                      <a:ext cx="5367655" cy="2253615"/>
                     </a:xfrm>
                     <a:prstGeom prst="rect">
                       <a:avLst/>
@@ -9694,7 +9982,25 @@
           <w:color w:val="000000"/>
           <w:sz w:val="28"/>
         </w:rPr>
-        <w:t>14.2 Admin Dashboard</w:t>
+        <w:t>1</w:t>
+      </w:r>
+      <w:r>
+        <w:rPr>
+          <w:rFonts w:ascii="Calibri" w:hAnsi="Calibri"/>
+          <w:b/>
+          <w:color w:val="000000"/>
+          <w:sz w:val="28"/>
+        </w:rPr>
+        <w:t>3</w:t>
+      </w:r>
+      <w:r>
+        <w:rPr>
+          <w:rFonts w:ascii="Calibri" w:hAnsi="Calibri"/>
+          <w:b/>
+          <w:color w:val="000000"/>
+          <w:sz w:val="28"/>
+        </w:rPr>
+        <w:t>.2 Admin Dashboard</w:t>
       </w:r>
     </w:p>
     <w:p>
@@ -9714,12 +10020,11 @@
         <w:rPr>
           <w:noProof/>
         </w:rPr>
-        <w:lastRenderedPageBreak/>
         <w:drawing>
-          <wp:inline distT="0" distB="0" distL="0" distR="0">
-            <wp:extent cx="5303520" cy="5303520"/>
-            <wp:effectExtent l="0" t="0" r="0" b="0"/>
-            <wp:docPr id="2" name="Picture 2"/>
+          <wp:inline distT="0" distB="0" distL="0" distR="0" wp14:anchorId="2F6A0563" wp14:editId="2141713B">
+            <wp:extent cx="5367655" cy="2448560"/>
+            <wp:effectExtent l="0" t="0" r="4445" b="8890"/>
+            <wp:docPr id="1" name="Picture 1"/>
             <wp:cNvGraphicFramePr>
               <a:graphicFrameLocks xmlns:a="http://schemas.openxmlformats.org/drawingml/2006/main" noChangeAspect="1"/>
             </wp:cNvGraphicFramePr>
@@ -9727,7 +10032,7 @@
               <a:graphicData uri="http://schemas.openxmlformats.org/drawingml/2006/picture">
                 <pic:pic xmlns:pic="http://schemas.openxmlformats.org/drawingml/2006/picture">
                   <pic:nvPicPr>
-                    <pic:cNvPr id="0" name="ui_admin_dashboard_1782228899406.png"/>
+                    <pic:cNvPr id="1" name=""/>
                     <pic:cNvPicPr/>
                   </pic:nvPicPr>
                   <pic:blipFill>
@@ -9739,7 +10044,7 @@
                   <pic:spPr>
                     <a:xfrm>
                       <a:off x="0" y="0"/>
-                      <a:ext cx="5303520" cy="5303520"/>
+                      <a:ext cx="5367655" cy="2448560"/>
                     </a:xfrm>
                     <a:prstGeom prst="rect">
                       <a:avLst/>
@@ -9755,35 +10060,301 @@
     <w:p>
       <w:pPr>
         <w:jc w:val="center"/>
-      </w:pPr>
-      <w:r>
         <w:rPr>
           <w:rFonts w:ascii="Calibri" w:hAnsi="Calibri"/>
           <w:i/>
           <w:color w:val="64748B"/>
           <w:sz w:val="18"/>
         </w:rPr>
+      </w:pPr>
+      <w:r>
+        <w:rPr>
+          <w:rFonts w:ascii="Calibri" w:hAnsi="Calibri"/>
+          <w:i/>
+          <w:color w:val="64748B"/>
+          <w:sz w:val="18"/>
+        </w:rPr>
         <w:t>Figure 14.2 — Admin Dashboard Overview</w:t>
       </w:r>
     </w:p>
     <w:p>
-      <w:r>
-        <w:br w:type="page"/>
-      </w:r>
-    </w:p>
+      <w:pPr>
+        <w:jc w:val="center"/>
+      </w:pPr>
+    </w:p>
+    <w:p>
+      <w:pPr>
+        <w:jc w:val="center"/>
+      </w:pPr>
+    </w:p>
+    <w:p>
+      <w:pPr>
+        <w:spacing w:before="240" w:after="80"/>
+        <w:rPr>
+          <w:rFonts w:ascii="Calibri" w:hAnsi="Calibri"/>
+          <w:b/>
+          <w:color w:val="000000"/>
+          <w:sz w:val="28"/>
+        </w:rPr>
+      </w:pPr>
+    </w:p>
+    <w:p>
+      <w:pPr>
+        <w:spacing w:before="240" w:after="80"/>
+      </w:pPr>
+      <w:r>
+        <w:rPr>
+          <w:rFonts w:ascii="Calibri" w:hAnsi="Calibri"/>
+          <w:b/>
+          <w:color w:val="000000"/>
+          <w:sz w:val="28"/>
+        </w:rPr>
+        <w:lastRenderedPageBreak/>
+        <w:t>1</w:t>
+      </w:r>
+      <w:r>
+        <w:rPr>
+          <w:rFonts w:ascii="Calibri" w:hAnsi="Calibri"/>
+          <w:b/>
+          <w:color w:val="000000"/>
+          <w:sz w:val="28"/>
+        </w:rPr>
+        <w:t>3</w:t>
+      </w:r>
+      <w:r>
+        <w:rPr>
+          <w:rFonts w:ascii="Calibri" w:hAnsi="Calibri"/>
+          <w:b/>
+          <w:color w:val="000000"/>
+          <w:sz w:val="28"/>
+        </w:rPr>
+        <w:t>.3 User Dashboard</w:t>
+      </w:r>
+    </w:p>
+    <w:p>
+      <w:r>
+        <w:t xml:space="preserve">The </w:t>
+      </w:r>
+      <w:r>
+        <w:rPr>
+          <w:b/>
+          <w:bCs/>
+        </w:rPr>
+        <w:t>User Dashboard (My Orders)</w:t>
+      </w:r>
+      <w:r>
+        <w:t xml:space="preserve"> provides a complete customer panel to track and manage retail purchases across Nepal, featuring status-based filtering and an inline search bar for past orders. It displays detailed multi-vendor order cards with item specifications, pricing, and fulfillment tags, alongside quick-actions like </w:t>
+      </w:r>
+      <w:r>
+        <w:rPr>
+          <w:b/>
+          <w:bCs/>
+        </w:rPr>
+        <w:t>Contact Seller</w:t>
+      </w:r>
+      <w:r>
+        <w:t xml:space="preserve"> and </w:t>
+      </w:r>
+      <w:r>
+        <w:rPr>
+          <w:b/>
+          <w:bCs/>
+        </w:rPr>
+        <w:t>Buy Again</w:t>
+      </w:r>
+      <w:r>
+        <w:t xml:space="preserve">. A consolidated sidebar menu also allows users to seamlessly manage their profile, adjust settings, or transition to a vendor via the "Sell On </w:t>
+      </w:r>
+      <w:r>
+        <w:t>Shop Ease</w:t>
+      </w:r>
+      <w:r>
+        <w:t>" portal.</w:t>
+      </w:r>
+    </w:p>
+    <w:p>
+      <w:r>
+        <w:rPr>
+          <w:noProof/>
+        </w:rPr>
+        <w:drawing>
+          <wp:inline distT="0" distB="0" distL="0" distR="0" wp14:anchorId="3CA4D382" wp14:editId="5D175A0D">
+            <wp:extent cx="5367655" cy="2614295"/>
+            <wp:effectExtent l="0" t="0" r="4445" b="0"/>
+            <wp:docPr id="8" name="Picture 8"/>
+            <wp:cNvGraphicFramePr>
+              <a:graphicFrameLocks xmlns:a="http://schemas.openxmlformats.org/drawingml/2006/main" noChangeAspect="1"/>
+            </wp:cNvGraphicFramePr>
+            <a:graphic xmlns:a="http://schemas.openxmlformats.org/drawingml/2006/main">
+              <a:graphicData uri="http://schemas.openxmlformats.org/drawingml/2006/picture">
+                <pic:pic xmlns:pic="http://schemas.openxmlformats.org/drawingml/2006/picture">
+                  <pic:nvPicPr>
+                    <pic:cNvPr id="1" name=""/>
+                    <pic:cNvPicPr/>
+                  </pic:nvPicPr>
+                  <pic:blipFill>
+                    <a:blip r:embed="rId8"/>
+                    <a:stretch>
+                      <a:fillRect/>
+                    </a:stretch>
+                  </pic:blipFill>
+                  <pic:spPr>
+                    <a:xfrm>
+                      <a:off x="0" y="0"/>
+                      <a:ext cx="5367655" cy="2614295"/>
+                    </a:xfrm>
+                    <a:prstGeom prst="rect">
+                      <a:avLst/>
+                    </a:prstGeom>
+                  </pic:spPr>
+                </pic:pic>
+              </a:graphicData>
+            </a:graphic>
+          </wp:inline>
+        </w:drawing>
+      </w:r>
+    </w:p>
+    <w:p>
+      <w:pPr>
+        <w:jc w:val="center"/>
+      </w:pPr>
+    </w:p>
+    <w:p>
+      <w:pPr>
+        <w:jc w:val="center"/>
+        <w:rPr>
+          <w:rFonts w:ascii="Calibri" w:hAnsi="Calibri"/>
+          <w:i/>
+          <w:color w:val="64748B"/>
+          <w:sz w:val="18"/>
+        </w:rPr>
+      </w:pPr>
+      <w:r>
+        <w:rPr>
+          <w:rFonts w:ascii="Calibri" w:hAnsi="Calibri"/>
+          <w:i/>
+          <w:color w:val="64748B"/>
+          <w:sz w:val="18"/>
+        </w:rPr>
+        <w:t xml:space="preserve">Figure 14.3 </w:t>
+      </w:r>
+      <w:r>
+        <w:rPr>
+          <w:rFonts w:ascii="Calibri" w:hAnsi="Calibri"/>
+          <w:i/>
+          <w:color w:val="64748B"/>
+          <w:sz w:val="18"/>
+        </w:rPr>
+        <w:t>— User</w:t>
+      </w:r>
+      <w:r>
+        <w:rPr>
+          <w:rFonts w:ascii="Calibri" w:hAnsi="Calibri"/>
+          <w:i/>
+          <w:color w:val="64748B"/>
+          <w:sz w:val="18"/>
+        </w:rPr>
+        <w:t xml:space="preserve"> Dashboard Overview</w:t>
+      </w:r>
+    </w:p>
+    <w:p/>
     <w:p>
       <w:pPr>
         <w:spacing w:before="360" w:after="120"/>
-      </w:pPr>
-      <w:r>
         <w:rPr>
           <w:rFonts w:ascii="Calibri" w:hAnsi="Calibri"/>
           <w:b/>
           <w:color w:val="000000"/>
           <w:sz w:val="36"/>
         </w:rPr>
+      </w:pPr>
+    </w:p>
+    <w:p>
+      <w:pPr>
+        <w:spacing w:before="360" w:after="120"/>
+        <w:rPr>
+          <w:rFonts w:ascii="Calibri" w:hAnsi="Calibri"/>
+          <w:b/>
+          <w:color w:val="000000"/>
+          <w:sz w:val="36"/>
+        </w:rPr>
+      </w:pPr>
+    </w:p>
+    <w:p>
+      <w:pPr>
+        <w:spacing w:before="360" w:after="120"/>
+        <w:rPr>
+          <w:rFonts w:ascii="Calibri" w:hAnsi="Calibri"/>
+          <w:b/>
+          <w:color w:val="000000"/>
+          <w:sz w:val="36"/>
+        </w:rPr>
+      </w:pPr>
+    </w:p>
+    <w:p>
+      <w:pPr>
+        <w:spacing w:before="360" w:after="120"/>
+        <w:rPr>
+          <w:rFonts w:ascii="Calibri" w:hAnsi="Calibri"/>
+          <w:b/>
+          <w:color w:val="000000"/>
+          <w:sz w:val="36"/>
+        </w:rPr>
+      </w:pPr>
+    </w:p>
+    <w:p>
+      <w:pPr>
+        <w:spacing w:before="360" w:after="120"/>
+        <w:rPr>
+          <w:rFonts w:ascii="Calibri" w:hAnsi="Calibri"/>
+          <w:b/>
+          <w:color w:val="000000"/>
+          <w:sz w:val="36"/>
+        </w:rPr>
+      </w:pPr>
+    </w:p>
+    <w:p>
+      <w:pPr>
+        <w:spacing w:before="360" w:after="120"/>
+        <w:rPr>
+          <w:rFonts w:ascii="Calibri" w:hAnsi="Calibri"/>
+          <w:b/>
+          <w:color w:val="000000"/>
+          <w:sz w:val="36"/>
+        </w:rPr>
+      </w:pPr>
+    </w:p>
+    <w:p>
+      <w:pPr>
+        <w:spacing w:before="360" w:after="120"/>
+      </w:pPr>
+      <w:r>
+        <w:rPr>
+          <w:rFonts w:ascii="Calibri" w:hAnsi="Calibri"/>
+          <w:b/>
+          <w:color w:val="000000"/>
+          <w:sz w:val="36"/>
+        </w:rPr>
         <w:lastRenderedPageBreak/>
-        <w:t>15. Use Case Diagram</w:t>
+        <w:t>1</w:t>
+      </w:r>
+      <w:r>
+        <w:rPr>
+          <w:rFonts w:ascii="Calibri" w:hAnsi="Calibri"/>
+          <w:b/>
+          <w:color w:val="000000"/>
+          <w:sz w:val="36"/>
+        </w:rPr>
+        <w:t>4</w:t>
+      </w:r>
+      <w:r>
+        <w:rPr>
+          <w:rFonts w:ascii="Calibri" w:hAnsi="Calibri"/>
+          <w:b/>
+          <w:color w:val="000000"/>
+          <w:sz w:val="36"/>
+        </w:rPr>
+        <w:t>. Use Case Diagram</w:t>
       </w:r>
     </w:p>
     <w:p>
@@ -9795,7 +10366,7 @@
           <w:color w:val="64748B"/>
           <w:sz w:val="18"/>
         </w:rPr>
-        <w:t>────────────────────────────────────────────────────────────────────────</w:t>
+        <w:t>───────────────────────────────────────────────────────────────────────</w:t>
       </w:r>
     </w:p>
     <w:p>
@@ -9831,7 +10402,7 @@
                     <pic:cNvPicPr/>
                   </pic:nvPicPr>
                   <pic:blipFill>
-                    <a:blip r:embed="rId8"/>
+                    <a:blip r:embed="rId9"/>
                     <a:stretch>
                       <a:fillRect/>
                     </a:stretch>
@@ -9902,6 +10473,17 @@
     <w:p>
       <w:pPr>
         <w:spacing w:before="240" w:after="80"/>
+        <w:rPr>
+          <w:rFonts w:ascii="Calibri" w:hAnsi="Calibri"/>
+          <w:b/>
+          <w:color w:val="000000"/>
+          <w:sz w:val="28"/>
+        </w:rPr>
+      </w:pPr>
+    </w:p>
+    <w:p>
+      <w:pPr>
+        <w:spacing w:before="240" w:after="80"/>
       </w:pPr>
       <w:r>
         <w:rPr>
@@ -9922,9 +10504,9 @@
         <w:tblLook w:val="04A0" w:firstRow="1" w:lastRow="0" w:firstColumn="1" w:lastColumn="0" w:noHBand="0" w:noVBand="1"/>
       </w:tblPr>
       <w:tblGrid>
-        <w:gridCol w:w="1984"/>
-        <w:gridCol w:w="2910"/>
-        <w:gridCol w:w="3775"/>
+        <w:gridCol w:w="1943"/>
+        <w:gridCol w:w="2850"/>
+        <w:gridCol w:w="3650"/>
       </w:tblGrid>
       <w:tr>
         <w:trPr>
@@ -10172,7 +10754,25 @@
           <w:sz w:val="36"/>
         </w:rPr>
         <w:lastRenderedPageBreak/>
-        <w:t>16. Data Flow Diagrams (DFD)</w:t>
+        <w:t>1</w:t>
+      </w:r>
+      <w:r>
+        <w:rPr>
+          <w:rFonts w:ascii="Calibri" w:hAnsi="Calibri"/>
+          <w:b/>
+          <w:color w:val="000000"/>
+          <w:sz w:val="36"/>
+        </w:rPr>
+        <w:t>5</w:t>
+      </w:r>
+      <w:r>
+        <w:rPr>
+          <w:rFonts w:ascii="Calibri" w:hAnsi="Calibri"/>
+          <w:b/>
+          <w:color w:val="000000"/>
+          <w:sz w:val="36"/>
+        </w:rPr>
+        <w:t>. Data Flow Diagrams (DFD)</w:t>
       </w:r>
     </w:p>
     <w:p>
@@ -10184,7 +10784,7 @@
           <w:color w:val="64748B"/>
           <w:sz w:val="18"/>
         </w:rPr>
-        <w:t>────────────────────────────────────────────────────────────────────────</w:t>
+        <w:t>───────────────────────────────────────────────────────────────────────</w:t>
       </w:r>
     </w:p>
     <w:p>
@@ -10243,7 +10843,7 @@
                     <pic:cNvPicPr/>
                   </pic:nvPicPr>
                   <pic:blipFill>
-                    <a:blip r:embed="rId9"/>
+                    <a:blip r:embed="rId10"/>
                     <a:stretch>
                       <a:fillRect/>
                     </a:stretch>
@@ -10334,9 +10934,9 @@
         <w:tblLook w:val="04A0" w:firstRow="1" w:lastRow="0" w:firstColumn="1" w:lastColumn="0" w:noHBand="0" w:noVBand="1"/>
       </w:tblPr>
       <w:tblGrid>
-        <w:gridCol w:w="1893"/>
         <w:gridCol w:w="1865"/>
-        <w:gridCol w:w="4911"/>
+        <w:gridCol w:w="1830"/>
+        <w:gridCol w:w="4748"/>
       </w:tblGrid>
       <w:tr>
         <w:trPr>
@@ -10704,23 +11304,7 @@
           <w:rFonts w:ascii="Calibri" w:hAnsi="Calibri"/>
           <w:color w:val="1E293B"/>
         </w:rPr>
-        <w:t xml:space="preserve">The Level 1 DFD decomposes the single system process into six sub-processes, each representing a major functional area of the application. Data stores (D1–D4) represent the </w:t>
-      </w:r>
-      <w:proofErr w:type="spellStart"/>
-      <w:r>
-        <w:rPr>
-          <w:rFonts w:ascii="Calibri" w:hAnsi="Calibri"/>
-          <w:color w:val="1E293B"/>
-        </w:rPr>
-        <w:t>localStorage</w:t>
-      </w:r>
-      <w:proofErr w:type="spellEnd"/>
-      <w:r>
-        <w:rPr>
-          <w:rFonts w:ascii="Calibri" w:hAnsi="Calibri"/>
-          <w:color w:val="1E293B"/>
-        </w:rPr>
-        <w:t xml:space="preserve"> keys used for data persistence.</w:t>
+        <w:t>The Level 1 DFD decomposes the single system process into six sub-processes, each representing a major functional area of the application. Data stores (D1–D4) represent the localStorage keys used for data persistence.</w:t>
       </w:r>
     </w:p>
     <w:p>
@@ -10747,7 +11331,7 @@
                     <pic:cNvPicPr/>
                   </pic:nvPicPr>
                   <pic:blipFill>
-                    <a:blip r:embed="rId10"/>
+                    <a:blip r:embed="rId11"/>
                     <a:stretch>
                       <a:fillRect/>
                     </a:stretch>
@@ -10827,9 +11411,9 @@
         <w:tblLook w:val="04A0" w:firstRow="1" w:lastRow="0" w:firstColumn="1" w:lastColumn="0" w:noHBand="0" w:noVBand="1"/>
       </w:tblPr>
       <w:tblGrid>
-        <w:gridCol w:w="981"/>
-        <w:gridCol w:w="2856"/>
-        <w:gridCol w:w="4832"/>
+        <w:gridCol w:w="975"/>
+        <w:gridCol w:w="2784"/>
+        <w:gridCol w:w="4684"/>
       </w:tblGrid>
       <w:tr>
         <w:trPr>
@@ -11236,7 +11820,25 @@
           <w:sz w:val="36"/>
         </w:rPr>
         <w:lastRenderedPageBreak/>
-        <w:t>17. Entity Relationship Diagram (ERD)</w:t>
+        <w:t>1</w:t>
+      </w:r>
+      <w:r>
+        <w:rPr>
+          <w:rFonts w:ascii="Calibri" w:hAnsi="Calibri"/>
+          <w:b/>
+          <w:color w:val="000000"/>
+          <w:sz w:val="36"/>
+        </w:rPr>
+        <w:t>6</w:t>
+      </w:r>
+      <w:r>
+        <w:rPr>
+          <w:rFonts w:ascii="Calibri" w:hAnsi="Calibri"/>
+          <w:b/>
+          <w:color w:val="000000"/>
+          <w:sz w:val="36"/>
+        </w:rPr>
+        <w:t>. Entity Relationship Diagram (ERD)</w:t>
       </w:r>
     </w:p>
     <w:p>
@@ -11248,7 +11850,7 @@
           <w:color w:val="64748B"/>
           <w:sz w:val="18"/>
         </w:rPr>
-        <w:t>────────────────────────────────────────────────────────────────────────</w:t>
+        <w:t>───────────────────────────────────────────────────────────────────────</w:t>
       </w:r>
     </w:p>
     <w:p>
@@ -11284,7 +11886,7 @@
                     <pic:cNvPicPr/>
                   </pic:nvPicPr>
                   <pic:blipFill>
-                    <a:blip r:embed="rId11"/>
+                    <a:blip r:embed="rId12"/>
                     <a:stretch>
                       <a:fillRect/>
                     </a:stretch>
@@ -11352,7 +11954,6 @@
           <w:color w:val="000000"/>
           <w:sz w:val="28"/>
         </w:rPr>
-        <w:lastRenderedPageBreak/>
         <w:t>Entity Descriptions</w:t>
       </w:r>
     </w:p>
@@ -11364,9 +11965,9 @@
         <w:tblLook w:val="04A0" w:firstRow="1" w:lastRow="0" w:firstColumn="1" w:lastColumn="0" w:noHBand="0" w:noVBand="1"/>
       </w:tblPr>
       <w:tblGrid>
-        <w:gridCol w:w="2019"/>
-        <w:gridCol w:w="2005"/>
-        <w:gridCol w:w="4645"/>
+        <w:gridCol w:w="1987"/>
+        <w:gridCol w:w="1969"/>
+        <w:gridCol w:w="4487"/>
       </w:tblGrid>
       <w:tr>
         <w:trPr>
@@ -11389,6 +11990,7 @@
                 <w:color w:val="FFFFFF"/>
                 <w:sz w:val="20"/>
               </w:rPr>
+              <w:lastRenderedPageBreak/>
               <w:t>Entity</w:t>
             </w:r>
           </w:p>
@@ -11831,10 +12433,10 @@
         <w:tblLook w:val="04A0" w:firstRow="1" w:lastRow="0" w:firstColumn="1" w:lastColumn="0" w:noHBand="0" w:noVBand="1"/>
       </w:tblPr>
       <w:tblGrid>
-        <w:gridCol w:w="2160"/>
-        <w:gridCol w:w="2160"/>
-        <w:gridCol w:w="2160"/>
-        <w:gridCol w:w="2160"/>
+        <w:gridCol w:w="2103"/>
+        <w:gridCol w:w="2115"/>
+        <w:gridCol w:w="2117"/>
+        <w:gridCol w:w="2108"/>
       </w:tblGrid>
       <w:tr>
         <w:trPr>
@@ -12413,10 +13015,157 @@
     <w:p/>
     <w:p>
       <w:pPr>
+        <w:spacing w:before="360" w:after="120"/>
+        <w:rPr>
+          <w:rFonts w:ascii="Calibri" w:hAnsi="Calibri"/>
+          <w:b/>
+          <w:color w:val="000000"/>
+          <w:sz w:val="36"/>
+        </w:rPr>
+      </w:pPr>
+    </w:p>
+    <w:p>
+      <w:pPr>
+        <w:spacing w:before="360" w:after="120"/>
+        <w:rPr>
+          <w:rFonts w:ascii="Calibri" w:hAnsi="Calibri"/>
+          <w:b/>
+          <w:color w:val="000000"/>
+          <w:sz w:val="36"/>
+        </w:rPr>
+      </w:pPr>
+    </w:p>
+    <w:p>
+      <w:pPr>
+        <w:spacing w:before="360" w:after="120"/>
+        <w:rPr>
+          <w:rFonts w:ascii="Calibri" w:hAnsi="Calibri"/>
+          <w:b/>
+          <w:color w:val="000000"/>
+          <w:sz w:val="36"/>
+        </w:rPr>
+      </w:pPr>
+    </w:p>
+    <w:p>
+      <w:pPr>
+        <w:spacing w:before="360" w:after="120"/>
+        <w:rPr>
+          <w:rFonts w:ascii="Calibri" w:hAnsi="Calibri"/>
+          <w:b/>
+          <w:color w:val="000000"/>
+          <w:sz w:val="36"/>
+        </w:rPr>
+      </w:pPr>
+    </w:p>
+    <w:p>
+      <w:pPr>
+        <w:spacing w:before="360" w:after="120"/>
+        <w:rPr>
+          <w:rFonts w:ascii="Calibri" w:hAnsi="Calibri"/>
+          <w:b/>
+          <w:color w:val="000000"/>
+          <w:sz w:val="36"/>
+        </w:rPr>
+      </w:pPr>
+    </w:p>
+    <w:p>
+      <w:pPr>
+        <w:spacing w:before="360" w:after="120"/>
+        <w:rPr>
+          <w:rFonts w:ascii="Calibri" w:hAnsi="Calibri"/>
+          <w:b/>
+          <w:color w:val="000000"/>
+          <w:sz w:val="36"/>
+        </w:rPr>
+      </w:pPr>
+    </w:p>
+    <w:p>
+      <w:pPr>
+        <w:spacing w:before="360" w:after="120"/>
+        <w:rPr>
+          <w:rFonts w:ascii="Calibri" w:hAnsi="Calibri"/>
+          <w:b/>
+          <w:color w:val="000000"/>
+          <w:sz w:val="36"/>
+        </w:rPr>
+      </w:pPr>
+    </w:p>
+    <w:p>
+      <w:pPr>
+        <w:spacing w:before="360" w:after="120"/>
+        <w:rPr>
+          <w:rFonts w:ascii="Calibri" w:hAnsi="Calibri"/>
+          <w:b/>
+          <w:color w:val="000000"/>
+          <w:sz w:val="36"/>
+        </w:rPr>
+      </w:pPr>
+    </w:p>
+    <w:p>
+      <w:pPr>
+        <w:spacing w:before="360" w:after="120"/>
+        <w:rPr>
+          <w:rFonts w:ascii="Calibri" w:hAnsi="Calibri"/>
+          <w:b/>
+          <w:color w:val="000000"/>
+          <w:sz w:val="36"/>
+        </w:rPr>
+      </w:pPr>
+    </w:p>
+    <w:p>
+      <w:pPr>
+        <w:spacing w:before="360" w:after="120"/>
+      </w:pPr>
+      <w:r>
+        <w:rPr>
+          <w:rFonts w:ascii="Calibri" w:hAnsi="Calibri"/>
+          <w:b/>
+          <w:color w:val="000000"/>
+          <w:sz w:val="36"/>
+        </w:rPr>
+        <w:lastRenderedPageBreak/>
+        <w:t>17. Conclusion</w:t>
+      </w:r>
+    </w:p>
+    <w:p>
+      <w:pPr>
+        <w:spacing w:after="160"/>
+      </w:pPr>
+      <w:r>
+        <w:rPr>
+          <w:color w:val="64748B"/>
+          <w:sz w:val="18"/>
+        </w:rPr>
+        <w:t>───────────────────────────────────────────────────────────────────────</w:t>
+      </w:r>
+    </w:p>
+    <w:p>
+      <w:r>
+        <w:rPr>
+          <w:rFonts w:ascii="Calibri" w:hAnsi="Calibri"/>
+          <w:color w:val="1E293B"/>
+        </w:rPr>
+        <w:t>ShopEase Nepal successfully demonstrates the design and implementation of a modern e-commerce frontend application using the React ecosystem. The project achieves its primary objectives: a visually polished, multi-role UI with amber-themed branding, clean component architecture, real-time cart management, and an automated deployment pipeline.</w:t>
+      </w:r>
+    </w:p>
+    <w:p>
+      <w:r>
+        <w:rPr>
+          <w:rFonts w:ascii="Calibri" w:hAnsi="Calibri"/>
+          <w:color w:val="1E293B"/>
+        </w:rPr>
+        <w:t>The codebase is structured for future scalability — context providers can be swapped for Redux or Zustand, static data can be replaced with API calls, and the Vite build pipeline already supports environment-based configuration for different deployment targets. The project serves as both a functional ecommerce prototype and a strong portfolio piece demonstrating team-based React development.</w:t>
+      </w:r>
+    </w:p>
+    <w:p>
+      <w:r>
+        <w:br w:type="page"/>
+      </w:r>
+    </w:p>
+    <w:p>
+      <w:pPr>
         <w:jc w:val="center"/>
       </w:pPr>
-      <w:bookmarkStart w:id="0" w:name="_GoBack"/>
-      <w:bookmarkEnd w:id="0"/>
     </w:p>
     <w:sectPr>
       <w:pgSz w:w="11909" w:h="16834"/>
@@ -12916,10 +13665,6 @@
     <w:lsdException w:name="Book Title" w:uiPriority="33" w:qFormat="1"/>
     <w:lsdException w:name="Bibliography" w:semiHidden="1" w:uiPriority="37" w:unhideWhenUsed="1"/>
     <w:lsdException w:name="TOC Heading" w:semiHidden="1" w:uiPriority="39" w:unhideWhenUsed="1" w:qFormat="1"/>
-    <w:lsdException w:name="Grid Table Light" w:semiHidden="1" w:unhideWhenUsed="1"/>
-    <w:lsdException w:name="Grid Table 1 Light" w:semiHidden="1" w:unhideWhenUsed="1"/>
-    <w:lsdException w:name="Grid Table 2" w:semiHidden="1" w:unhideWhenUsed="1"/>
-    <w:lsdException w:name="Grid Table 3" w:semiHidden="1" w:unhideWhenUsed="1"/>
     <w:lsdException w:name="Grid Table 4" w:uiPriority="49"/>
     <w:lsdException w:name="Grid Table 5 Dark" w:uiPriority="50"/>
     <w:lsdException w:name="Grid Table 6 Colorful" w:uiPriority="51"/>
@@ -13023,7 +13768,7 @@
   <w:style w:type="paragraph" w:default="1" w:styleId="Normal">
     <w:name w:val="Normal"/>
     <w:qFormat/>
-    <w:rsid w:val="00FC693F"/>
+    <w:rsid w:val="00275FD3"/>
   </w:style>
   <w:style w:type="paragraph" w:styleId="Heading1">
     <w:name w:val="heading 1"/>
@@ -24342,7 +25087,7 @@
 </file>
 
 <file path=customXml/itemProps1.xml><?xml version="1.0" encoding="utf-8"?>
-<ds:datastoreItem xmlns:ds="http://schemas.openxmlformats.org/officeDocument/2006/customXml" ds:itemID="{FB9A56EE-A668-48A8-A84C-A95846C30485}">
+<ds:datastoreItem xmlns:ds="http://schemas.openxmlformats.org/officeDocument/2006/customXml" ds:itemID="{E12B6C96-5C9B-4ED9-9C2B-023C237CC315}">
   <ds:schemaRefs>
     <ds:schemaRef ds:uri="http://schemas.openxmlformats.org/officeDocument/2006/bibliography"/>
   </ds:schemaRefs>

</xml_diff>